<commit_message>
feat: crear y listar cursos
- Crear todos los modelos de dominio.

- Crear todos los formularios, vistas y urls.

- Crear templates para listar y crear cursos.
</commit_message>
<xml_diff>
--- a/Development and Deployment.docx
+++ b/Development and Deployment.docx
@@ -5340,7 +5340,19 @@
           <w:lang w:val="en-US"/>
           <w14:ligatures w14:val="none"/>
         </w:rPr>
-        <w:t>apps.users.Usuario</w:t>
+        <w:t>u</w:t>
+      </w:r>
+      <w:r>
+        <w:rPr>
+          <w:rFonts w:ascii="Consolas" w:eastAsia="Times New Roman" w:hAnsi="Consolas" w:cs="Times New Roman"/>
+          <w:color w:val="E6DB74"/>
+          <w:kern w:val="0"/>
+          <w:sz w:val="21"/>
+          <w:szCs w:val="21"/>
+          <w:lang w:val="en-US"/>
+          <w14:ligatures w14:val="none"/>
+        </w:rPr>
+        <w:t>sers.Usuario</w:t>
       </w:r>
       <w:proofErr w:type="spellEnd"/>
       <w:r>
@@ -9129,7 +9141,7 @@
           <w:kern w:val="0"/>
           <w:sz w:val="21"/>
           <w:szCs w:val="21"/>
-          <w:lang w:val="es-MX"/>
+          <w:lang w:val="en-US"/>
           <w14:ligatures w14:val="none"/>
         </w:rPr>
         <w:t xml:space="preserve">  </w:t>
@@ -10443,7 +10455,7 @@
           <w:kern w:val="0"/>
           <w:sz w:val="21"/>
           <w:szCs w:val="21"/>
-          <w:lang w:val="es-MX"/>
+          <w:lang w:val="en-US"/>
           <w14:ligatures w14:val="none"/>
         </w:rPr>
         <w:t xml:space="preserve">  </w:t>
@@ -11575,6 +11587,7 @@
       <w:r>
         <w:rPr>
           <w:rFonts w:ascii="Times New Roman" w:hAnsi="Times New Roman" w:cs="Times New Roman"/>
+          <w:noProof/>
           <w:lang w:val="es-MX"/>
         </w:rPr>
         <w:drawing>
@@ -11679,6 +11692,7 @@
       <w:r>
         <w:rPr>
           <w:rFonts w:ascii="Times New Roman" w:hAnsi="Times New Roman" w:cs="Times New Roman"/>
+          <w:noProof/>
           <w:lang w:val="es-MX"/>
         </w:rPr>
         <w:drawing>
@@ -11720,6 +11734,190 @@
     </w:p>
     <w:p>
       <w:pPr>
+        <w:shd w:val="clear" w:color="auto" w:fill="272822"/>
+        <w:spacing w:line="285" w:lineRule="atLeast"/>
+        <w:jc w:val="left"/>
+        <w:rPr>
+          <w:rFonts w:ascii="Consolas" w:eastAsia="Times New Roman" w:hAnsi="Consolas" w:cs="Times New Roman"/>
+          <w:color w:val="F8F8F2"/>
+          <w:kern w:val="0"/>
+          <w:sz w:val="21"/>
+          <w:szCs w:val="21"/>
+          <w:lang w:val="en-US"/>
+          <w14:ligatures w14:val="none"/>
+        </w:rPr>
+      </w:pPr>
+      <w:r>
+        <w:rPr>
+          <w:rFonts w:ascii="Consolas" w:eastAsia="Times New Roman" w:hAnsi="Consolas" w:cs="Times New Roman"/>
+          <w:color w:val="F8F8F2"/>
+          <w:kern w:val="0"/>
+          <w:sz w:val="21"/>
+          <w:szCs w:val="21"/>
+          <w:lang w:val="en-US"/>
+          <w14:ligatures w14:val="none"/>
+        </w:rPr>
+        <w:t># settings.py</w:t>
+      </w:r>
+    </w:p>
+    <w:p>
+      <w:pPr>
+        <w:shd w:val="clear" w:color="auto" w:fill="272822"/>
+        <w:spacing w:line="285" w:lineRule="atLeast"/>
+        <w:jc w:val="left"/>
+        <w:rPr>
+          <w:rFonts w:ascii="Consolas" w:eastAsia="Times New Roman" w:hAnsi="Consolas" w:cs="Times New Roman"/>
+          <w:color w:val="F8F8F2"/>
+          <w:kern w:val="0"/>
+          <w:sz w:val="21"/>
+          <w:szCs w:val="21"/>
+          <w:lang w:val="en-US"/>
+          <w14:ligatures w14:val="none"/>
+        </w:rPr>
+      </w:pPr>
+      <w:r>
+        <w:rPr>
+          <w:rFonts w:ascii="Consolas" w:eastAsia="Times New Roman" w:hAnsi="Consolas" w:cs="Times New Roman"/>
+          <w:color w:val="F8F8F2"/>
+          <w:kern w:val="0"/>
+          <w:sz w:val="21"/>
+          <w:szCs w:val="21"/>
+          <w:lang w:val="en-US"/>
+          <w14:ligatures w14:val="none"/>
+        </w:rPr>
+        <w:t xml:space="preserve">STATICFILES_DIRS </w:t>
+      </w:r>
+      <w:r>
+        <w:rPr>
+          <w:rFonts w:ascii="Consolas" w:eastAsia="Times New Roman" w:hAnsi="Consolas" w:cs="Times New Roman"/>
+          <w:color w:val="F92672"/>
+          <w:kern w:val="0"/>
+          <w:sz w:val="21"/>
+          <w:szCs w:val="21"/>
+          <w:lang w:val="en-US"/>
+          <w14:ligatures w14:val="none"/>
+        </w:rPr>
+        <w:t>=</w:t>
+      </w:r>
+      <w:r>
+        <w:rPr>
+          <w:rFonts w:ascii="Consolas" w:eastAsia="Times New Roman" w:hAnsi="Consolas" w:cs="Times New Roman"/>
+          <w:color w:val="F8F8F2"/>
+          <w:kern w:val="0"/>
+          <w:sz w:val="21"/>
+          <w:szCs w:val="21"/>
+          <w:lang w:val="en-US"/>
+          <w14:ligatures w14:val="none"/>
+        </w:rPr>
+        <w:t xml:space="preserve"> [</w:t>
+      </w:r>
+    </w:p>
+    <w:p>
+      <w:pPr>
+        <w:shd w:val="clear" w:color="auto" w:fill="272822"/>
+        <w:spacing w:line="285" w:lineRule="atLeast"/>
+        <w:jc w:val="left"/>
+        <w:rPr>
+          <w:rFonts w:ascii="Consolas" w:eastAsia="Times New Roman" w:hAnsi="Consolas" w:cs="Times New Roman"/>
+          <w:color w:val="F8F8F2"/>
+          <w:kern w:val="0"/>
+          <w:sz w:val="21"/>
+          <w:szCs w:val="21"/>
+          <w:lang w:val="en-US"/>
+          <w14:ligatures w14:val="none"/>
+        </w:rPr>
+      </w:pPr>
+      <w:r>
+        <w:rPr>
+          <w:rFonts w:ascii="Consolas" w:eastAsia="Times New Roman" w:hAnsi="Consolas" w:cs="Times New Roman"/>
+          <w:color w:val="F8F8F2"/>
+          <w:kern w:val="0"/>
+          <w:sz w:val="21"/>
+          <w:szCs w:val="21"/>
+          <w:lang w:val="en-US"/>
+          <w14:ligatures w14:val="none"/>
+        </w:rPr>
+        <w:t xml:space="preserve">  BASE_DIR </w:t>
+      </w:r>
+      <w:r>
+        <w:rPr>
+          <w:rFonts w:ascii="Consolas" w:eastAsia="Times New Roman" w:hAnsi="Consolas" w:cs="Times New Roman"/>
+          <w:color w:val="66D9EF"/>
+          <w:kern w:val="0"/>
+          <w:sz w:val="21"/>
+          <w:szCs w:val="21"/>
+          <w:lang w:val="en-US"/>
+          <w14:ligatures w14:val="none"/>
+        </w:rPr>
+        <w:t>/</w:t>
+      </w:r>
+      <w:r>
+        <w:rPr>
+          <w:rFonts w:ascii="Consolas" w:eastAsia="Times New Roman" w:hAnsi="Consolas" w:cs="Times New Roman"/>
+          <w:color w:val="F8F8F2"/>
+          <w:kern w:val="0"/>
+          <w:sz w:val="21"/>
+          <w:szCs w:val="21"/>
+          <w:lang w:val="en-US"/>
+          <w14:ligatures w14:val="none"/>
+        </w:rPr>
+        <w:t xml:space="preserve"> </w:t>
+      </w:r>
+      <w:r>
+        <w:rPr>
+          <w:rFonts w:ascii="Consolas" w:eastAsia="Times New Roman" w:hAnsi="Consolas" w:cs="Times New Roman"/>
+          <w:color w:val="E6DB74"/>
+          <w:kern w:val="0"/>
+          <w:sz w:val="21"/>
+          <w:szCs w:val="21"/>
+          <w:lang w:val="en-US"/>
+          <w14:ligatures w14:val="none"/>
+        </w:rPr>
+        <w:t>'static'</w:t>
+      </w:r>
+      <w:r>
+        <w:rPr>
+          <w:rFonts w:ascii="Consolas" w:eastAsia="Times New Roman" w:hAnsi="Consolas" w:cs="Times New Roman"/>
+          <w:color w:val="F8F8F2"/>
+          <w:kern w:val="0"/>
+          <w:sz w:val="21"/>
+          <w:szCs w:val="21"/>
+          <w:lang w:val="en-US"/>
+          <w14:ligatures w14:val="none"/>
+        </w:rPr>
+        <w:t>,</w:t>
+      </w:r>
+    </w:p>
+    <w:p>
+      <w:pPr>
+        <w:shd w:val="clear" w:color="auto" w:fill="272822"/>
+        <w:spacing w:line="285" w:lineRule="atLeast"/>
+        <w:jc w:val="left"/>
+        <w:rPr>
+          <w:rFonts w:ascii="Consolas" w:eastAsia="Times New Roman" w:hAnsi="Consolas" w:cs="Times New Roman"/>
+          <w:color w:val="F8F8F2"/>
+          <w:kern w:val="0"/>
+          <w:sz w:val="21"/>
+          <w:szCs w:val="21"/>
+          <w:lang w:val="en-US"/>
+          <w14:ligatures w14:val="none"/>
+        </w:rPr>
+      </w:pPr>
+      <w:r>
+        <w:rPr>
+          <w:rFonts w:ascii="Consolas" w:eastAsia="Times New Roman" w:hAnsi="Consolas" w:cs="Times New Roman"/>
+          <w:color w:val="F8F8F2"/>
+          <w:kern w:val="0"/>
+          <w:sz w:val="21"/>
+          <w:szCs w:val="21"/>
+          <w:lang w:val="en-US"/>
+          <w14:ligatures w14:val="none"/>
+        </w:rPr>
+        <w:t>]</w:t>
+      </w:r>
+    </w:p>
+    <w:p>
+      <w:pPr>
         <w:pStyle w:val="Prrafodelista"/>
         <w:numPr>
           <w:ilvl w:val="0"/>
@@ -11736,6 +11934,7 @@
           <w:rFonts w:ascii="Times New Roman" w:hAnsi="Times New Roman" w:cs="Times New Roman"/>
           <w:lang w:val="en-US"/>
         </w:rPr>
+        <w:lastRenderedPageBreak/>
         <w:t>Run the server to test t</w:t>
       </w:r>
       <w:r>
@@ -11743,12 +11942,23 @@
           <w:rFonts w:ascii="Times New Roman" w:hAnsi="Times New Roman" w:cs="Times New Roman"/>
           <w:lang w:val="en-US"/>
         </w:rPr>
-        <w:t>he signup/login:</w:t>
-      </w:r>
-    </w:p>
-    <w:p>
-      <w:pPr>
-        <w:ind w:left="360"/>
+        <w:t>he signup/login</w:t>
+      </w:r>
+      <w:r>
+        <w:rPr>
+          <w:rFonts w:ascii="Times New Roman" w:hAnsi="Times New Roman" w:cs="Times New Roman"/>
+          <w:lang w:val="en-US"/>
+        </w:rPr>
+        <w:t xml:space="preserve"> flow.</w:t>
+      </w:r>
+    </w:p>
+    <w:p>
+      <w:pPr>
+        <w:pStyle w:val="Prrafodelista"/>
+        <w:numPr>
+          <w:ilvl w:val="0"/>
+          <w:numId w:val="2"/>
+        </w:numPr>
         <w:jc w:val="both"/>
         <w:rPr>
           <w:rFonts w:ascii="Times New Roman" w:hAnsi="Times New Roman" w:cs="Times New Roman"/>
@@ -12096,7 +12306,7 @@
                                   </pic:cNvPicPr>
                                 </pic:nvPicPr>
                                 <pic:blipFill>
-                                  <a:blip r:embed="rId1">
+                                  <a:blip r:embed="rId2">
                                     <a:extLst>
                                       <a:ext uri="{28A0092B-C50C-407E-A947-70E740481C1C}">
                                         <a14:useLocalDpi xmlns:a14="http://schemas.microsoft.com/office/drawing/2010/main" val="0"/>

</xml_diff>